<commit_message>
Alteração feita na branch nova-funcionalidade
</commit_message>
<xml_diff>
--- a/Relatorio/UC00617.docx
+++ b/Relatorio/UC00617.docx
@@ -203,6 +203,798 @@
       </w:r>
     </w:p>
     <w:p/>
+    <w:p>
+      <w:r>
+        <w:rPr>
+          <w:noProof/>
+        </w:rPr>
+        <w:drawing>
+          <wp:inline distT="0" distB="0" distL="0" distR="0" wp14:anchorId="2441B6A2" wp14:editId="7D9AC9BF">
+            <wp:extent cx="5722620" cy="2087880"/>
+            <wp:effectExtent l="0" t="0" r="0" b="7620"/>
+            <wp:docPr id="177790541" name="Imagem 2"/>
+            <wp:cNvGraphicFramePr>
+              <a:graphicFrameLocks xmlns:a="http://schemas.openxmlformats.org/drawingml/2006/main" noChangeAspect="1"/>
+            </wp:cNvGraphicFramePr>
+            <a:graphic xmlns:a="http://schemas.openxmlformats.org/drawingml/2006/main">
+              <a:graphicData uri="http://schemas.openxmlformats.org/drawingml/2006/picture">
+                <pic:pic xmlns:pic="http://schemas.openxmlformats.org/drawingml/2006/picture">
+                  <pic:nvPicPr>
+                    <pic:cNvPr id="0" name="Picture 2"/>
+                    <pic:cNvPicPr>
+                      <a:picLocks noChangeAspect="1" noChangeArrowheads="1"/>
+                    </pic:cNvPicPr>
+                  </pic:nvPicPr>
+                  <pic:blipFill>
+                    <a:blip r:embed="rId6">
+                      <a:extLst>
+                        <a:ext uri="{28A0092B-C50C-407E-A947-70E740481C1C}">
+                          <a14:useLocalDpi xmlns:a14="http://schemas.microsoft.com/office/drawing/2010/main" val="0"/>
+                        </a:ext>
+                      </a:extLst>
+                    </a:blip>
+                    <a:srcRect/>
+                    <a:stretch>
+                      <a:fillRect/>
+                    </a:stretch>
+                  </pic:blipFill>
+                  <pic:spPr bwMode="auto">
+                    <a:xfrm>
+                      <a:off x="0" y="0"/>
+                      <a:ext cx="5722620" cy="2087880"/>
+                    </a:xfrm>
+                    <a:prstGeom prst="rect">
+                      <a:avLst/>
+                    </a:prstGeom>
+                    <a:noFill/>
+                    <a:ln>
+                      <a:noFill/>
+                    </a:ln>
+                  </pic:spPr>
+                </pic:pic>
+              </a:graphicData>
+            </a:graphic>
+          </wp:inline>
+        </w:drawing>
+      </w:r>
+    </w:p>
+    <w:p>
+      <w:r>
+        <w:t xml:space="preserve">Após a criação da estrutura do projeto, foi inicializado um repositório </w:t>
+      </w:r>
+      <w:proofErr w:type="spellStart"/>
+      <w:r>
+        <w:t>Git</w:t>
+      </w:r>
+      <w:proofErr w:type="spellEnd"/>
+      <w:r>
+        <w:t xml:space="preserve"> na pasta principal através do comando "</w:t>
+      </w:r>
+      <w:proofErr w:type="spellStart"/>
+      <w:r>
+        <w:t>git</w:t>
+      </w:r>
+      <w:proofErr w:type="spellEnd"/>
+      <w:r>
+        <w:t xml:space="preserve"> </w:t>
+      </w:r>
+      <w:proofErr w:type="spellStart"/>
+      <w:r>
+        <w:t>init</w:t>
+      </w:r>
+      <w:proofErr w:type="spellEnd"/>
+      <w:r>
+        <w:t>".</w:t>
+      </w:r>
+    </w:p>
+    <w:p/>
+    <w:p>
+      <w:r>
+        <w:t>Este procedimento permite iniciar o controlo de versões, possibilitando o registo e acompanhamento de todas as alterações realizadas aos ficheiros do projeto.</w:t>
+      </w:r>
+    </w:p>
+    <w:p>
+      <w:r>
+        <w:drawing>
+          <wp:inline distT="0" distB="0" distL="0" distR="0" wp14:anchorId="4E75FCEE" wp14:editId="0B0EBDB3">
+            <wp:extent cx="5731510" cy="455930"/>
+            <wp:effectExtent l="0" t="0" r="2540" b="1270"/>
+            <wp:docPr id="1648140778" name="Imagem 1"/>
+            <wp:cNvGraphicFramePr>
+              <a:graphicFrameLocks xmlns:a="http://schemas.openxmlformats.org/drawingml/2006/main" noChangeAspect="1"/>
+            </wp:cNvGraphicFramePr>
+            <a:graphic xmlns:a="http://schemas.openxmlformats.org/drawingml/2006/main">
+              <a:graphicData uri="http://schemas.openxmlformats.org/drawingml/2006/picture">
+                <pic:pic xmlns:pic="http://schemas.openxmlformats.org/drawingml/2006/picture">
+                  <pic:nvPicPr>
+                    <pic:cNvPr id="1648140778" name=""/>
+                    <pic:cNvPicPr/>
+                  </pic:nvPicPr>
+                  <pic:blipFill>
+                    <a:blip r:embed="rId7"/>
+                    <a:stretch>
+                      <a:fillRect/>
+                    </a:stretch>
+                  </pic:blipFill>
+                  <pic:spPr>
+                    <a:xfrm>
+                      <a:off x="0" y="0"/>
+                      <a:ext cx="5731510" cy="455930"/>
+                    </a:xfrm>
+                    <a:prstGeom prst="rect">
+                      <a:avLst/>
+                    </a:prstGeom>
+                  </pic:spPr>
+                </pic:pic>
+              </a:graphicData>
+            </a:graphic>
+          </wp:inline>
+        </w:drawing>
+      </w:r>
+    </w:p>
+    <w:p>
+      <w:r>
+        <w:lastRenderedPageBreak/>
+        <w:t>De seguida, foi utilizado o comando "</w:t>
+      </w:r>
+      <w:proofErr w:type="spellStart"/>
+      <w:r>
+        <w:t>git</w:t>
+      </w:r>
+      <w:proofErr w:type="spellEnd"/>
+      <w:r>
+        <w:t xml:space="preserve"> </w:t>
+      </w:r>
+      <w:proofErr w:type="spellStart"/>
+      <w:proofErr w:type="gramStart"/>
+      <w:r>
+        <w:t>add</w:t>
+      </w:r>
+      <w:proofErr w:type="spellEnd"/>
+      <w:r>
+        <w:t xml:space="preserve"> .</w:t>
+      </w:r>
+      <w:proofErr w:type="gramEnd"/>
+      <w:r>
+        <w:t xml:space="preserve">" para adicionar todos os ficheiros à </w:t>
+      </w:r>
+      <w:proofErr w:type="spellStart"/>
+      <w:r>
+        <w:t>staging</w:t>
+      </w:r>
+      <w:proofErr w:type="spellEnd"/>
+      <w:r>
+        <w:t xml:space="preserve"> </w:t>
+      </w:r>
+      <w:proofErr w:type="spellStart"/>
+      <w:r>
+        <w:t>area</w:t>
+      </w:r>
+      <w:proofErr w:type="spellEnd"/>
+      <w:r>
+        <w:t>.</w:t>
+      </w:r>
+    </w:p>
+    <w:p/>
+    <w:p>
+      <w:r>
+        <w:t>Após este passo, foi possível verificar através do comando "</w:t>
+      </w:r>
+      <w:proofErr w:type="spellStart"/>
+      <w:r>
+        <w:t>git</w:t>
+      </w:r>
+      <w:proofErr w:type="spellEnd"/>
+      <w:r>
+        <w:t xml:space="preserve"> status" que os ficheiros se encontram prontos para serem incluídos num </w:t>
+      </w:r>
+      <w:proofErr w:type="spellStart"/>
+      <w:r>
+        <w:t>commit</w:t>
+      </w:r>
+      <w:proofErr w:type="spellEnd"/>
+      <w:r>
+        <w:t>, passando para o estado "</w:t>
+      </w:r>
+      <w:proofErr w:type="spellStart"/>
+      <w:r>
+        <w:t>Changes</w:t>
+      </w:r>
+      <w:proofErr w:type="spellEnd"/>
+      <w:r>
+        <w:t xml:space="preserve"> to </w:t>
+      </w:r>
+      <w:proofErr w:type="spellStart"/>
+      <w:r>
+        <w:t>be</w:t>
+      </w:r>
+      <w:proofErr w:type="spellEnd"/>
+      <w:r>
+        <w:t xml:space="preserve"> </w:t>
+      </w:r>
+      <w:proofErr w:type="spellStart"/>
+      <w:r>
+        <w:t>committed</w:t>
+      </w:r>
+      <w:proofErr w:type="spellEnd"/>
+      <w:r>
+        <w:t>".</w:t>
+      </w:r>
+    </w:p>
+    <w:p>
+      <w:r>
+        <w:drawing>
+          <wp:inline distT="0" distB="0" distL="0" distR="0" wp14:anchorId="6D7870A0" wp14:editId="31C872F4">
+            <wp:extent cx="5731510" cy="2165985"/>
+            <wp:effectExtent l="0" t="0" r="2540" b="5715"/>
+            <wp:docPr id="1983786127" name="Imagem 1"/>
+            <wp:cNvGraphicFramePr>
+              <a:graphicFrameLocks xmlns:a="http://schemas.openxmlformats.org/drawingml/2006/main" noChangeAspect="1"/>
+            </wp:cNvGraphicFramePr>
+            <a:graphic xmlns:a="http://schemas.openxmlformats.org/drawingml/2006/main">
+              <a:graphicData uri="http://schemas.openxmlformats.org/drawingml/2006/picture">
+                <pic:pic xmlns:pic="http://schemas.openxmlformats.org/drawingml/2006/picture">
+                  <pic:nvPicPr>
+                    <pic:cNvPr id="1983786127" name=""/>
+                    <pic:cNvPicPr/>
+                  </pic:nvPicPr>
+                  <pic:blipFill>
+                    <a:blip r:embed="rId8"/>
+                    <a:stretch>
+                      <a:fillRect/>
+                    </a:stretch>
+                  </pic:blipFill>
+                  <pic:spPr>
+                    <a:xfrm>
+                      <a:off x="0" y="0"/>
+                      <a:ext cx="5731510" cy="2165985"/>
+                    </a:xfrm>
+                    <a:prstGeom prst="rect">
+                      <a:avLst/>
+                    </a:prstGeom>
+                  </pic:spPr>
+                </pic:pic>
+              </a:graphicData>
+            </a:graphic>
+          </wp:inline>
+        </w:drawing>
+      </w:r>
+    </w:p>
+    <w:p/>
+    <w:p>
+      <w:r>
+        <w:drawing>
+          <wp:inline distT="0" distB="0" distL="0" distR="0" wp14:anchorId="446F6015" wp14:editId="4509A5E9">
+            <wp:extent cx="5731510" cy="1017905"/>
+            <wp:effectExtent l="0" t="0" r="2540" b="0"/>
+            <wp:docPr id="1049071885" name="Imagem 1"/>
+            <wp:cNvGraphicFramePr>
+              <a:graphicFrameLocks xmlns:a="http://schemas.openxmlformats.org/drawingml/2006/main" noChangeAspect="1"/>
+            </wp:cNvGraphicFramePr>
+            <a:graphic xmlns:a="http://schemas.openxmlformats.org/drawingml/2006/main">
+              <a:graphicData uri="http://schemas.openxmlformats.org/drawingml/2006/picture">
+                <pic:pic xmlns:pic="http://schemas.openxmlformats.org/drawingml/2006/picture">
+                  <pic:nvPicPr>
+                    <pic:cNvPr id="1049071885" name=""/>
+                    <pic:cNvPicPr/>
+                  </pic:nvPicPr>
+                  <pic:blipFill>
+                    <a:blip r:embed="rId9"/>
+                    <a:stretch>
+                      <a:fillRect/>
+                    </a:stretch>
+                  </pic:blipFill>
+                  <pic:spPr>
+                    <a:xfrm>
+                      <a:off x="0" y="0"/>
+                      <a:ext cx="5731510" cy="1017905"/>
+                    </a:xfrm>
+                    <a:prstGeom prst="rect">
+                      <a:avLst/>
+                    </a:prstGeom>
+                  </pic:spPr>
+                </pic:pic>
+              </a:graphicData>
+            </a:graphic>
+          </wp:inline>
+        </w:drawing>
+      </w:r>
+    </w:p>
+    <w:p/>
+    <w:p/>
+    <w:p/>
+    <w:p/>
+    <w:p/>
+    <w:p/>
+    <w:p/>
+    <w:p/>
+    <w:p/>
+    <w:p/>
+    <w:p/>
+    <w:p>
+      <w:r>
+        <w:lastRenderedPageBreak/>
+        <w:t>Para analisar o histórico do repositório, foram utilizados os comandos "</w:t>
+      </w:r>
+      <w:proofErr w:type="spellStart"/>
+      <w:r>
+        <w:t>git</w:t>
+      </w:r>
+      <w:proofErr w:type="spellEnd"/>
+      <w:r>
+        <w:t xml:space="preserve"> log" e "</w:t>
+      </w:r>
+      <w:proofErr w:type="spellStart"/>
+      <w:r>
+        <w:t>git</w:t>
+      </w:r>
+      <w:proofErr w:type="spellEnd"/>
+      <w:r>
+        <w:t xml:space="preserve"> log --</w:t>
+      </w:r>
+      <w:proofErr w:type="spellStart"/>
+      <w:r>
+        <w:t>oneline</w:t>
+      </w:r>
+      <w:proofErr w:type="spellEnd"/>
+      <w:r>
+        <w:t>".</w:t>
+      </w:r>
+    </w:p>
+    <w:p>
+      <w:r>
+        <w:t>O comando "</w:t>
+      </w:r>
+      <w:proofErr w:type="spellStart"/>
+      <w:r>
+        <w:t>git</w:t>
+      </w:r>
+      <w:proofErr w:type="spellEnd"/>
+      <w:r>
+        <w:t xml:space="preserve"> log" permite visualizar informação detalhada sobre os </w:t>
+      </w:r>
+      <w:proofErr w:type="spellStart"/>
+      <w:r>
+        <w:t>commits</w:t>
+      </w:r>
+      <w:proofErr w:type="spellEnd"/>
+      <w:r>
+        <w:t>, incluindo o autor, data e mensagem associada.</w:t>
+      </w:r>
+    </w:p>
+    <w:p>
+      <w:r>
+        <w:t>Por outro lado, o comando "</w:t>
+      </w:r>
+      <w:proofErr w:type="spellStart"/>
+      <w:r>
+        <w:t>git</w:t>
+      </w:r>
+      <w:proofErr w:type="spellEnd"/>
+      <w:r>
+        <w:t xml:space="preserve"> log --</w:t>
+      </w:r>
+      <w:proofErr w:type="spellStart"/>
+      <w:r>
+        <w:t>oneline</w:t>
+      </w:r>
+      <w:proofErr w:type="spellEnd"/>
+      <w:r>
+        <w:t xml:space="preserve">" apresenta uma versão resumida do histórico, facilitando a leitura dos </w:t>
+      </w:r>
+      <w:proofErr w:type="spellStart"/>
+      <w:r>
+        <w:t>commits</w:t>
+      </w:r>
+      <w:proofErr w:type="spellEnd"/>
+      <w:r>
+        <w:t xml:space="preserve"> realizados.</w:t>
+      </w:r>
+    </w:p>
+    <w:p/>
+    <w:p>
+      <w:r>
+        <w:drawing>
+          <wp:inline distT="0" distB="0" distL="0" distR="0" wp14:anchorId="58A4771F" wp14:editId="2E126328">
+            <wp:extent cx="5731510" cy="1701800"/>
+            <wp:effectExtent l="0" t="0" r="2540" b="0"/>
+            <wp:docPr id="1434213497" name="Imagem 1"/>
+            <wp:cNvGraphicFramePr>
+              <a:graphicFrameLocks xmlns:a="http://schemas.openxmlformats.org/drawingml/2006/main" noChangeAspect="1"/>
+            </wp:cNvGraphicFramePr>
+            <a:graphic xmlns:a="http://schemas.openxmlformats.org/drawingml/2006/main">
+              <a:graphicData uri="http://schemas.openxmlformats.org/drawingml/2006/picture">
+                <pic:pic xmlns:pic="http://schemas.openxmlformats.org/drawingml/2006/picture">
+                  <pic:nvPicPr>
+                    <pic:cNvPr id="1434213497" name=""/>
+                    <pic:cNvPicPr/>
+                  </pic:nvPicPr>
+                  <pic:blipFill>
+                    <a:blip r:embed="rId10"/>
+                    <a:stretch>
+                      <a:fillRect/>
+                    </a:stretch>
+                  </pic:blipFill>
+                  <pic:spPr>
+                    <a:xfrm>
+                      <a:off x="0" y="0"/>
+                      <a:ext cx="5731510" cy="1701800"/>
+                    </a:xfrm>
+                    <a:prstGeom prst="rect">
+                      <a:avLst/>
+                    </a:prstGeom>
+                  </pic:spPr>
+                </pic:pic>
+              </a:graphicData>
+            </a:graphic>
+          </wp:inline>
+        </w:drawing>
+      </w:r>
+    </w:p>
+    <w:p/>
+    <w:p>
+      <w:r>
+        <w:t>Após a realização de alterações ao ficheiro index.html, foi utilizado o comando "</w:t>
+      </w:r>
+      <w:proofErr w:type="spellStart"/>
+      <w:r>
+        <w:t>git</w:t>
+      </w:r>
+      <w:proofErr w:type="spellEnd"/>
+      <w:r>
+        <w:t xml:space="preserve"> status" para verificar as modificações efetuadas.</w:t>
+      </w:r>
+    </w:p>
+    <w:p>
+      <w:r>
+        <w:t xml:space="preserve">De seguida, as alterações foram adicionadas à </w:t>
+      </w:r>
+      <w:proofErr w:type="spellStart"/>
+      <w:r>
+        <w:t>staging</w:t>
+      </w:r>
+      <w:proofErr w:type="spellEnd"/>
+      <w:r>
+        <w:t xml:space="preserve"> </w:t>
+      </w:r>
+      <w:proofErr w:type="spellStart"/>
+      <w:r>
+        <w:t>area</w:t>
+      </w:r>
+      <w:proofErr w:type="spellEnd"/>
+      <w:r>
+        <w:t xml:space="preserve"> com o comando "</w:t>
+      </w:r>
+      <w:proofErr w:type="spellStart"/>
+      <w:r>
+        <w:t>git</w:t>
+      </w:r>
+      <w:proofErr w:type="spellEnd"/>
+      <w:r>
+        <w:t xml:space="preserve"> </w:t>
+      </w:r>
+      <w:proofErr w:type="spellStart"/>
+      <w:proofErr w:type="gramStart"/>
+      <w:r>
+        <w:t>add</w:t>
+      </w:r>
+      <w:proofErr w:type="spellEnd"/>
+      <w:r>
+        <w:t xml:space="preserve"> .</w:t>
+      </w:r>
+      <w:proofErr w:type="gramEnd"/>
+      <w:r>
+        <w:t xml:space="preserve">", sendo posteriormente registadas através de um novo </w:t>
+      </w:r>
+      <w:proofErr w:type="spellStart"/>
+      <w:r>
+        <w:t>commit</w:t>
+      </w:r>
+      <w:proofErr w:type="spellEnd"/>
+      <w:r>
+        <w:t xml:space="preserve"> com o comando "</w:t>
+      </w:r>
+      <w:proofErr w:type="spellStart"/>
+      <w:r>
+        <w:t>git</w:t>
+      </w:r>
+      <w:proofErr w:type="spellEnd"/>
+      <w:r>
+        <w:t xml:space="preserve"> </w:t>
+      </w:r>
+      <w:proofErr w:type="spellStart"/>
+      <w:r>
+        <w:t>commit</w:t>
+      </w:r>
+      <w:proofErr w:type="spellEnd"/>
+      <w:r>
+        <w:t>".</w:t>
+      </w:r>
+    </w:p>
+    <w:p>
+      <w:r>
+        <w:t xml:space="preserve">Este processo demonstra a atualização do projeto e o registo das alterações no histórico do repositório </w:t>
+      </w:r>
+      <w:proofErr w:type="spellStart"/>
+      <w:r>
+        <w:t>Git</w:t>
+      </w:r>
+      <w:proofErr w:type="spellEnd"/>
+      <w:r>
+        <w:t>.</w:t>
+      </w:r>
+    </w:p>
+    <w:p>
+      <w:r>
+        <w:rPr>
+          <w:noProof/>
+        </w:rPr>
+        <w:drawing>
+          <wp:inline distT="0" distB="0" distL="0" distR="0" wp14:anchorId="7F34A0DF" wp14:editId="520F627C">
+            <wp:extent cx="5731510" cy="1581785"/>
+            <wp:effectExtent l="0" t="0" r="2540" b="0"/>
+            <wp:docPr id="1186953988" name="Imagem 3"/>
+            <wp:cNvGraphicFramePr>
+              <a:graphicFrameLocks xmlns:a="http://schemas.openxmlformats.org/drawingml/2006/main" noChangeAspect="1"/>
+            </wp:cNvGraphicFramePr>
+            <a:graphic xmlns:a="http://schemas.openxmlformats.org/drawingml/2006/main">
+              <a:graphicData uri="http://schemas.openxmlformats.org/drawingml/2006/picture">
+                <pic:pic xmlns:pic="http://schemas.openxmlformats.org/drawingml/2006/picture">
+                  <pic:nvPicPr>
+                    <pic:cNvPr id="0" name="Picture 3"/>
+                    <pic:cNvPicPr>
+                      <a:picLocks noChangeAspect="1" noChangeArrowheads="1"/>
+                    </pic:cNvPicPr>
+                  </pic:nvPicPr>
+                  <pic:blipFill>
+                    <a:blip r:embed="rId11">
+                      <a:extLst>
+                        <a:ext uri="{28A0092B-C50C-407E-A947-70E740481C1C}">
+                          <a14:useLocalDpi xmlns:a14="http://schemas.microsoft.com/office/drawing/2010/main" val="0"/>
+                        </a:ext>
+                      </a:extLst>
+                    </a:blip>
+                    <a:srcRect/>
+                    <a:stretch>
+                      <a:fillRect/>
+                    </a:stretch>
+                  </pic:blipFill>
+                  <pic:spPr bwMode="auto">
+                    <a:xfrm>
+                      <a:off x="0" y="0"/>
+                      <a:ext cx="5731510" cy="1581785"/>
+                    </a:xfrm>
+                    <a:prstGeom prst="rect">
+                      <a:avLst/>
+                    </a:prstGeom>
+                    <a:noFill/>
+                    <a:ln>
+                      <a:noFill/>
+                    </a:ln>
+                  </pic:spPr>
+                </pic:pic>
+              </a:graphicData>
+            </a:graphic>
+          </wp:inline>
+        </w:drawing>
+      </w:r>
+    </w:p>
+    <w:p/>
+    <w:p/>
+    <w:p/>
+    <w:p>
+      <w:r>
+        <w:lastRenderedPageBreak/>
+        <w:t>Foi novamente utilizado o comando "</w:t>
+      </w:r>
+      <w:proofErr w:type="spellStart"/>
+      <w:r>
+        <w:t>git</w:t>
+      </w:r>
+      <w:proofErr w:type="spellEnd"/>
+      <w:r>
+        <w:t xml:space="preserve"> log --</w:t>
+      </w:r>
+      <w:proofErr w:type="spellStart"/>
+      <w:r>
+        <w:t>oneline</w:t>
+      </w:r>
+      <w:proofErr w:type="spellEnd"/>
+      <w:r>
+        <w:t xml:space="preserve">" para verificar o histórico de </w:t>
+      </w:r>
+      <w:proofErr w:type="spellStart"/>
+      <w:r>
+        <w:t>commits</w:t>
+      </w:r>
+      <w:proofErr w:type="spellEnd"/>
+      <w:r>
+        <w:t xml:space="preserve"> após a realização de alterações.</w:t>
+      </w:r>
+    </w:p>
+    <w:p>
+      <w:r>
+        <w:t xml:space="preserve">Foi possível observar a existência de dois </w:t>
+      </w:r>
+      <w:proofErr w:type="spellStart"/>
+      <w:r>
+        <w:t>commits</w:t>
+      </w:r>
+      <w:proofErr w:type="spellEnd"/>
+      <w:r>
+        <w:t>, demonstrando a evolução do projeto e o registo incremental das modificações efetuadas.</w:t>
+      </w:r>
+    </w:p>
+    <w:p/>
+    <w:p>
+      <w:r>
+        <w:drawing>
+          <wp:inline distT="0" distB="0" distL="0" distR="0" wp14:anchorId="2B35AFD7" wp14:editId="26D8DF22">
+            <wp:extent cx="5731510" cy="608330"/>
+            <wp:effectExtent l="0" t="0" r="2540" b="1270"/>
+            <wp:docPr id="1202079896" name="Imagem 1"/>
+            <wp:cNvGraphicFramePr>
+              <a:graphicFrameLocks xmlns:a="http://schemas.openxmlformats.org/drawingml/2006/main" noChangeAspect="1"/>
+            </wp:cNvGraphicFramePr>
+            <a:graphic xmlns:a="http://schemas.openxmlformats.org/drawingml/2006/main">
+              <a:graphicData uri="http://schemas.openxmlformats.org/drawingml/2006/picture">
+                <pic:pic xmlns:pic="http://schemas.openxmlformats.org/drawingml/2006/picture">
+                  <pic:nvPicPr>
+                    <pic:cNvPr id="1202079896" name=""/>
+                    <pic:cNvPicPr/>
+                  </pic:nvPicPr>
+                  <pic:blipFill>
+                    <a:blip r:embed="rId12"/>
+                    <a:stretch>
+                      <a:fillRect/>
+                    </a:stretch>
+                  </pic:blipFill>
+                  <pic:spPr>
+                    <a:xfrm>
+                      <a:off x="0" y="0"/>
+                      <a:ext cx="5731510" cy="608330"/>
+                    </a:xfrm>
+                    <a:prstGeom prst="rect">
+                      <a:avLst/>
+                    </a:prstGeom>
+                  </pic:spPr>
+                </pic:pic>
+              </a:graphicData>
+            </a:graphic>
+          </wp:inline>
+        </w:drawing>
+      </w:r>
+    </w:p>
+    <w:p/>
+    <w:p>
+      <w:r>
+        <w:t xml:space="preserve">Foi </w:t>
+      </w:r>
+      <w:proofErr w:type="gramStart"/>
+      <w:r>
+        <w:t>criada uma nova</w:t>
+      </w:r>
+      <w:proofErr w:type="gramEnd"/>
+      <w:r>
+        <w:t xml:space="preserve"> </w:t>
+      </w:r>
+      <w:proofErr w:type="spellStart"/>
+      <w:r>
+        <w:t>branch</w:t>
+      </w:r>
+      <w:proofErr w:type="spellEnd"/>
+      <w:r>
+        <w:t xml:space="preserve"> com o objetivo de desenvolver alterações de forma isolada.</w:t>
+      </w:r>
+    </w:p>
+    <w:p/>
+    <w:p>
+      <w:r>
+        <w:t>De seguida, foi utilizado o comando "</w:t>
+      </w:r>
+      <w:proofErr w:type="spellStart"/>
+      <w:r>
+        <w:t>git</w:t>
+      </w:r>
+      <w:proofErr w:type="spellEnd"/>
+      <w:r>
+        <w:t xml:space="preserve"> checkout" para mudar para a nova </w:t>
+      </w:r>
+      <w:proofErr w:type="spellStart"/>
+      <w:r>
+        <w:t>branch</w:t>
+      </w:r>
+      <w:proofErr w:type="spellEnd"/>
+      <w:r>
+        <w:t xml:space="preserve">, permitindo trabalhar de forma independente sem afetar a </w:t>
+      </w:r>
+      <w:proofErr w:type="spellStart"/>
+      <w:r>
+        <w:t>branch</w:t>
+      </w:r>
+      <w:proofErr w:type="spellEnd"/>
+      <w:r>
+        <w:t xml:space="preserve"> principal.</w:t>
+      </w:r>
+    </w:p>
+    <w:p>
+      <w:r>
+        <w:drawing>
+          <wp:inline distT="0" distB="0" distL="0" distR="0" wp14:anchorId="52A86254" wp14:editId="6E48301F">
+            <wp:extent cx="5731510" cy="847725"/>
+            <wp:effectExtent l="0" t="0" r="2540" b="9525"/>
+            <wp:docPr id="734992089" name="Imagem 1"/>
+            <wp:cNvGraphicFramePr>
+              <a:graphicFrameLocks xmlns:a="http://schemas.openxmlformats.org/drawingml/2006/main" noChangeAspect="1"/>
+            </wp:cNvGraphicFramePr>
+            <a:graphic xmlns:a="http://schemas.openxmlformats.org/drawingml/2006/main">
+              <a:graphicData uri="http://schemas.openxmlformats.org/drawingml/2006/picture">
+                <pic:pic xmlns:pic="http://schemas.openxmlformats.org/drawingml/2006/picture">
+                  <pic:nvPicPr>
+                    <pic:cNvPr id="734992089" name=""/>
+                    <pic:cNvPicPr/>
+                  </pic:nvPicPr>
+                  <pic:blipFill>
+                    <a:blip r:embed="rId13"/>
+                    <a:stretch>
+                      <a:fillRect/>
+                    </a:stretch>
+                  </pic:blipFill>
+                  <pic:spPr>
+                    <a:xfrm>
+                      <a:off x="0" y="0"/>
+                      <a:ext cx="5731510" cy="847725"/>
+                    </a:xfrm>
+                    <a:prstGeom prst="rect">
+                      <a:avLst/>
+                    </a:prstGeom>
+                  </pic:spPr>
+                </pic:pic>
+              </a:graphicData>
+            </a:graphic>
+          </wp:inline>
+        </w:drawing>
+      </w:r>
+    </w:p>
+    <w:p>
+      <w:r>
+        <w:drawing>
+          <wp:inline distT="0" distB="0" distL="0" distR="0" wp14:anchorId="6A465A31" wp14:editId="198FBC27">
+            <wp:extent cx="5731510" cy="744220"/>
+            <wp:effectExtent l="0" t="0" r="2540" b="0"/>
+            <wp:docPr id="1278242973" name="Imagem 1"/>
+            <wp:cNvGraphicFramePr>
+              <a:graphicFrameLocks xmlns:a="http://schemas.openxmlformats.org/drawingml/2006/main" noChangeAspect="1"/>
+            </wp:cNvGraphicFramePr>
+            <a:graphic xmlns:a="http://schemas.openxmlformats.org/drawingml/2006/main">
+              <a:graphicData uri="http://schemas.openxmlformats.org/drawingml/2006/picture">
+                <pic:pic xmlns:pic="http://schemas.openxmlformats.org/drawingml/2006/picture">
+                  <pic:nvPicPr>
+                    <pic:cNvPr id="1278242973" name=""/>
+                    <pic:cNvPicPr/>
+                  </pic:nvPicPr>
+                  <pic:blipFill>
+                    <a:blip r:embed="rId14"/>
+                    <a:stretch>
+                      <a:fillRect/>
+                    </a:stretch>
+                  </pic:blipFill>
+                  <pic:spPr>
+                    <a:xfrm>
+                      <a:off x="0" y="0"/>
+                      <a:ext cx="5731510" cy="744220"/>
+                    </a:xfrm>
+                    <a:prstGeom prst="rect">
+                      <a:avLst/>
+                    </a:prstGeom>
+                  </pic:spPr>
+                </pic:pic>
+              </a:graphicData>
+            </a:graphic>
+          </wp:inline>
+        </w:drawing>
+      </w:r>
+    </w:p>
     <w:p/>
     <w:p/>
     <w:sectPr>

</xml_diff>

<commit_message>
Remoção de ficheiros desnecessários e adição de .gitignore
</commit_message>
<xml_diff>
--- a/Relatorio/UC00617.docx
+++ b/Relatorio/UC00617.docx
@@ -203,6 +203,798 @@
       </w:r>
     </w:p>
     <w:p/>
+    <w:p>
+      <w:r>
+        <w:rPr>
+          <w:noProof/>
+        </w:rPr>
+        <w:drawing>
+          <wp:inline distT="0" distB="0" distL="0" distR="0" wp14:anchorId="2441B6A2" wp14:editId="7D9AC9BF">
+            <wp:extent cx="5722620" cy="2087880"/>
+            <wp:effectExtent l="0" t="0" r="0" b="7620"/>
+            <wp:docPr id="177790541" name="Imagem 2"/>
+            <wp:cNvGraphicFramePr>
+              <a:graphicFrameLocks xmlns:a="http://schemas.openxmlformats.org/drawingml/2006/main" noChangeAspect="1"/>
+            </wp:cNvGraphicFramePr>
+            <a:graphic xmlns:a="http://schemas.openxmlformats.org/drawingml/2006/main">
+              <a:graphicData uri="http://schemas.openxmlformats.org/drawingml/2006/picture">
+                <pic:pic xmlns:pic="http://schemas.openxmlformats.org/drawingml/2006/picture">
+                  <pic:nvPicPr>
+                    <pic:cNvPr id="0" name="Picture 2"/>
+                    <pic:cNvPicPr>
+                      <a:picLocks noChangeAspect="1" noChangeArrowheads="1"/>
+                    </pic:cNvPicPr>
+                  </pic:nvPicPr>
+                  <pic:blipFill>
+                    <a:blip r:embed="rId6">
+                      <a:extLst>
+                        <a:ext uri="{28A0092B-C50C-407E-A947-70E740481C1C}">
+                          <a14:useLocalDpi xmlns:a14="http://schemas.microsoft.com/office/drawing/2010/main" val="0"/>
+                        </a:ext>
+                      </a:extLst>
+                    </a:blip>
+                    <a:srcRect/>
+                    <a:stretch>
+                      <a:fillRect/>
+                    </a:stretch>
+                  </pic:blipFill>
+                  <pic:spPr bwMode="auto">
+                    <a:xfrm>
+                      <a:off x="0" y="0"/>
+                      <a:ext cx="5722620" cy="2087880"/>
+                    </a:xfrm>
+                    <a:prstGeom prst="rect">
+                      <a:avLst/>
+                    </a:prstGeom>
+                    <a:noFill/>
+                    <a:ln>
+                      <a:noFill/>
+                    </a:ln>
+                  </pic:spPr>
+                </pic:pic>
+              </a:graphicData>
+            </a:graphic>
+          </wp:inline>
+        </w:drawing>
+      </w:r>
+    </w:p>
+    <w:p>
+      <w:r>
+        <w:t xml:space="preserve">Após a criação da estrutura do projeto, foi inicializado um repositório </w:t>
+      </w:r>
+      <w:proofErr w:type="spellStart"/>
+      <w:r>
+        <w:t>Git</w:t>
+      </w:r>
+      <w:proofErr w:type="spellEnd"/>
+      <w:r>
+        <w:t xml:space="preserve"> na pasta principal através do comando "</w:t>
+      </w:r>
+      <w:proofErr w:type="spellStart"/>
+      <w:r>
+        <w:t>git</w:t>
+      </w:r>
+      <w:proofErr w:type="spellEnd"/>
+      <w:r>
+        <w:t xml:space="preserve"> </w:t>
+      </w:r>
+      <w:proofErr w:type="spellStart"/>
+      <w:r>
+        <w:t>init</w:t>
+      </w:r>
+      <w:proofErr w:type="spellEnd"/>
+      <w:r>
+        <w:t>".</w:t>
+      </w:r>
+    </w:p>
+    <w:p/>
+    <w:p>
+      <w:r>
+        <w:t>Este procedimento permite iniciar o controlo de versões, possibilitando o registo e acompanhamento de todas as alterações realizadas aos ficheiros do projeto.</w:t>
+      </w:r>
+    </w:p>
+    <w:p>
+      <w:r>
+        <w:drawing>
+          <wp:inline distT="0" distB="0" distL="0" distR="0" wp14:anchorId="4E75FCEE" wp14:editId="0B0EBDB3">
+            <wp:extent cx="5731510" cy="455930"/>
+            <wp:effectExtent l="0" t="0" r="2540" b="1270"/>
+            <wp:docPr id="1648140778" name="Imagem 1"/>
+            <wp:cNvGraphicFramePr>
+              <a:graphicFrameLocks xmlns:a="http://schemas.openxmlformats.org/drawingml/2006/main" noChangeAspect="1"/>
+            </wp:cNvGraphicFramePr>
+            <a:graphic xmlns:a="http://schemas.openxmlformats.org/drawingml/2006/main">
+              <a:graphicData uri="http://schemas.openxmlformats.org/drawingml/2006/picture">
+                <pic:pic xmlns:pic="http://schemas.openxmlformats.org/drawingml/2006/picture">
+                  <pic:nvPicPr>
+                    <pic:cNvPr id="1648140778" name=""/>
+                    <pic:cNvPicPr/>
+                  </pic:nvPicPr>
+                  <pic:blipFill>
+                    <a:blip r:embed="rId7"/>
+                    <a:stretch>
+                      <a:fillRect/>
+                    </a:stretch>
+                  </pic:blipFill>
+                  <pic:spPr>
+                    <a:xfrm>
+                      <a:off x="0" y="0"/>
+                      <a:ext cx="5731510" cy="455930"/>
+                    </a:xfrm>
+                    <a:prstGeom prst="rect">
+                      <a:avLst/>
+                    </a:prstGeom>
+                  </pic:spPr>
+                </pic:pic>
+              </a:graphicData>
+            </a:graphic>
+          </wp:inline>
+        </w:drawing>
+      </w:r>
+    </w:p>
+    <w:p>
+      <w:r>
+        <w:lastRenderedPageBreak/>
+        <w:t>De seguida, foi utilizado o comando "</w:t>
+      </w:r>
+      <w:proofErr w:type="spellStart"/>
+      <w:r>
+        <w:t>git</w:t>
+      </w:r>
+      <w:proofErr w:type="spellEnd"/>
+      <w:r>
+        <w:t xml:space="preserve"> </w:t>
+      </w:r>
+      <w:proofErr w:type="spellStart"/>
+      <w:proofErr w:type="gramStart"/>
+      <w:r>
+        <w:t>add</w:t>
+      </w:r>
+      <w:proofErr w:type="spellEnd"/>
+      <w:r>
+        <w:t xml:space="preserve"> .</w:t>
+      </w:r>
+      <w:proofErr w:type="gramEnd"/>
+      <w:r>
+        <w:t xml:space="preserve">" para adicionar todos os ficheiros à </w:t>
+      </w:r>
+      <w:proofErr w:type="spellStart"/>
+      <w:r>
+        <w:t>staging</w:t>
+      </w:r>
+      <w:proofErr w:type="spellEnd"/>
+      <w:r>
+        <w:t xml:space="preserve"> </w:t>
+      </w:r>
+      <w:proofErr w:type="spellStart"/>
+      <w:r>
+        <w:t>area</w:t>
+      </w:r>
+      <w:proofErr w:type="spellEnd"/>
+      <w:r>
+        <w:t>.</w:t>
+      </w:r>
+    </w:p>
+    <w:p/>
+    <w:p>
+      <w:r>
+        <w:t>Após este passo, foi possível verificar através do comando "</w:t>
+      </w:r>
+      <w:proofErr w:type="spellStart"/>
+      <w:r>
+        <w:t>git</w:t>
+      </w:r>
+      <w:proofErr w:type="spellEnd"/>
+      <w:r>
+        <w:t xml:space="preserve"> status" que os ficheiros se encontram prontos para serem incluídos num </w:t>
+      </w:r>
+      <w:proofErr w:type="spellStart"/>
+      <w:r>
+        <w:t>commit</w:t>
+      </w:r>
+      <w:proofErr w:type="spellEnd"/>
+      <w:r>
+        <w:t>, passando para o estado "</w:t>
+      </w:r>
+      <w:proofErr w:type="spellStart"/>
+      <w:r>
+        <w:t>Changes</w:t>
+      </w:r>
+      <w:proofErr w:type="spellEnd"/>
+      <w:r>
+        <w:t xml:space="preserve"> to </w:t>
+      </w:r>
+      <w:proofErr w:type="spellStart"/>
+      <w:r>
+        <w:t>be</w:t>
+      </w:r>
+      <w:proofErr w:type="spellEnd"/>
+      <w:r>
+        <w:t xml:space="preserve"> </w:t>
+      </w:r>
+      <w:proofErr w:type="spellStart"/>
+      <w:r>
+        <w:t>committed</w:t>
+      </w:r>
+      <w:proofErr w:type="spellEnd"/>
+      <w:r>
+        <w:t>".</w:t>
+      </w:r>
+    </w:p>
+    <w:p>
+      <w:r>
+        <w:drawing>
+          <wp:inline distT="0" distB="0" distL="0" distR="0" wp14:anchorId="6D7870A0" wp14:editId="31C872F4">
+            <wp:extent cx="5731510" cy="2165985"/>
+            <wp:effectExtent l="0" t="0" r="2540" b="5715"/>
+            <wp:docPr id="1983786127" name="Imagem 1"/>
+            <wp:cNvGraphicFramePr>
+              <a:graphicFrameLocks xmlns:a="http://schemas.openxmlformats.org/drawingml/2006/main" noChangeAspect="1"/>
+            </wp:cNvGraphicFramePr>
+            <a:graphic xmlns:a="http://schemas.openxmlformats.org/drawingml/2006/main">
+              <a:graphicData uri="http://schemas.openxmlformats.org/drawingml/2006/picture">
+                <pic:pic xmlns:pic="http://schemas.openxmlformats.org/drawingml/2006/picture">
+                  <pic:nvPicPr>
+                    <pic:cNvPr id="1983786127" name=""/>
+                    <pic:cNvPicPr/>
+                  </pic:nvPicPr>
+                  <pic:blipFill>
+                    <a:blip r:embed="rId8"/>
+                    <a:stretch>
+                      <a:fillRect/>
+                    </a:stretch>
+                  </pic:blipFill>
+                  <pic:spPr>
+                    <a:xfrm>
+                      <a:off x="0" y="0"/>
+                      <a:ext cx="5731510" cy="2165985"/>
+                    </a:xfrm>
+                    <a:prstGeom prst="rect">
+                      <a:avLst/>
+                    </a:prstGeom>
+                  </pic:spPr>
+                </pic:pic>
+              </a:graphicData>
+            </a:graphic>
+          </wp:inline>
+        </w:drawing>
+      </w:r>
+    </w:p>
+    <w:p/>
+    <w:p>
+      <w:r>
+        <w:drawing>
+          <wp:inline distT="0" distB="0" distL="0" distR="0" wp14:anchorId="446F6015" wp14:editId="4509A5E9">
+            <wp:extent cx="5731510" cy="1017905"/>
+            <wp:effectExtent l="0" t="0" r="2540" b="0"/>
+            <wp:docPr id="1049071885" name="Imagem 1"/>
+            <wp:cNvGraphicFramePr>
+              <a:graphicFrameLocks xmlns:a="http://schemas.openxmlformats.org/drawingml/2006/main" noChangeAspect="1"/>
+            </wp:cNvGraphicFramePr>
+            <a:graphic xmlns:a="http://schemas.openxmlformats.org/drawingml/2006/main">
+              <a:graphicData uri="http://schemas.openxmlformats.org/drawingml/2006/picture">
+                <pic:pic xmlns:pic="http://schemas.openxmlformats.org/drawingml/2006/picture">
+                  <pic:nvPicPr>
+                    <pic:cNvPr id="1049071885" name=""/>
+                    <pic:cNvPicPr/>
+                  </pic:nvPicPr>
+                  <pic:blipFill>
+                    <a:blip r:embed="rId9"/>
+                    <a:stretch>
+                      <a:fillRect/>
+                    </a:stretch>
+                  </pic:blipFill>
+                  <pic:spPr>
+                    <a:xfrm>
+                      <a:off x="0" y="0"/>
+                      <a:ext cx="5731510" cy="1017905"/>
+                    </a:xfrm>
+                    <a:prstGeom prst="rect">
+                      <a:avLst/>
+                    </a:prstGeom>
+                  </pic:spPr>
+                </pic:pic>
+              </a:graphicData>
+            </a:graphic>
+          </wp:inline>
+        </w:drawing>
+      </w:r>
+    </w:p>
+    <w:p/>
+    <w:p/>
+    <w:p/>
+    <w:p/>
+    <w:p/>
+    <w:p/>
+    <w:p/>
+    <w:p/>
+    <w:p/>
+    <w:p/>
+    <w:p/>
+    <w:p>
+      <w:r>
+        <w:lastRenderedPageBreak/>
+        <w:t>Para analisar o histórico do repositório, foram utilizados os comandos "</w:t>
+      </w:r>
+      <w:proofErr w:type="spellStart"/>
+      <w:r>
+        <w:t>git</w:t>
+      </w:r>
+      <w:proofErr w:type="spellEnd"/>
+      <w:r>
+        <w:t xml:space="preserve"> log" e "</w:t>
+      </w:r>
+      <w:proofErr w:type="spellStart"/>
+      <w:r>
+        <w:t>git</w:t>
+      </w:r>
+      <w:proofErr w:type="spellEnd"/>
+      <w:r>
+        <w:t xml:space="preserve"> log --</w:t>
+      </w:r>
+      <w:proofErr w:type="spellStart"/>
+      <w:r>
+        <w:t>oneline</w:t>
+      </w:r>
+      <w:proofErr w:type="spellEnd"/>
+      <w:r>
+        <w:t>".</w:t>
+      </w:r>
+    </w:p>
+    <w:p>
+      <w:r>
+        <w:t>O comando "</w:t>
+      </w:r>
+      <w:proofErr w:type="spellStart"/>
+      <w:r>
+        <w:t>git</w:t>
+      </w:r>
+      <w:proofErr w:type="spellEnd"/>
+      <w:r>
+        <w:t xml:space="preserve"> log" permite visualizar informação detalhada sobre os </w:t>
+      </w:r>
+      <w:proofErr w:type="spellStart"/>
+      <w:r>
+        <w:t>commits</w:t>
+      </w:r>
+      <w:proofErr w:type="spellEnd"/>
+      <w:r>
+        <w:t>, incluindo o autor, data e mensagem associada.</w:t>
+      </w:r>
+    </w:p>
+    <w:p>
+      <w:r>
+        <w:t>Por outro lado, o comando "</w:t>
+      </w:r>
+      <w:proofErr w:type="spellStart"/>
+      <w:r>
+        <w:t>git</w:t>
+      </w:r>
+      <w:proofErr w:type="spellEnd"/>
+      <w:r>
+        <w:t xml:space="preserve"> log --</w:t>
+      </w:r>
+      <w:proofErr w:type="spellStart"/>
+      <w:r>
+        <w:t>oneline</w:t>
+      </w:r>
+      <w:proofErr w:type="spellEnd"/>
+      <w:r>
+        <w:t xml:space="preserve">" apresenta uma versão resumida do histórico, facilitando a leitura dos </w:t>
+      </w:r>
+      <w:proofErr w:type="spellStart"/>
+      <w:r>
+        <w:t>commits</w:t>
+      </w:r>
+      <w:proofErr w:type="spellEnd"/>
+      <w:r>
+        <w:t xml:space="preserve"> realizados.</w:t>
+      </w:r>
+    </w:p>
+    <w:p/>
+    <w:p>
+      <w:r>
+        <w:drawing>
+          <wp:inline distT="0" distB="0" distL="0" distR="0" wp14:anchorId="58A4771F" wp14:editId="2E126328">
+            <wp:extent cx="5731510" cy="1701800"/>
+            <wp:effectExtent l="0" t="0" r="2540" b="0"/>
+            <wp:docPr id="1434213497" name="Imagem 1"/>
+            <wp:cNvGraphicFramePr>
+              <a:graphicFrameLocks xmlns:a="http://schemas.openxmlformats.org/drawingml/2006/main" noChangeAspect="1"/>
+            </wp:cNvGraphicFramePr>
+            <a:graphic xmlns:a="http://schemas.openxmlformats.org/drawingml/2006/main">
+              <a:graphicData uri="http://schemas.openxmlformats.org/drawingml/2006/picture">
+                <pic:pic xmlns:pic="http://schemas.openxmlformats.org/drawingml/2006/picture">
+                  <pic:nvPicPr>
+                    <pic:cNvPr id="1434213497" name=""/>
+                    <pic:cNvPicPr/>
+                  </pic:nvPicPr>
+                  <pic:blipFill>
+                    <a:blip r:embed="rId10"/>
+                    <a:stretch>
+                      <a:fillRect/>
+                    </a:stretch>
+                  </pic:blipFill>
+                  <pic:spPr>
+                    <a:xfrm>
+                      <a:off x="0" y="0"/>
+                      <a:ext cx="5731510" cy="1701800"/>
+                    </a:xfrm>
+                    <a:prstGeom prst="rect">
+                      <a:avLst/>
+                    </a:prstGeom>
+                  </pic:spPr>
+                </pic:pic>
+              </a:graphicData>
+            </a:graphic>
+          </wp:inline>
+        </w:drawing>
+      </w:r>
+    </w:p>
+    <w:p/>
+    <w:p>
+      <w:r>
+        <w:t>Após a realização de alterações ao ficheiro index.html, foi utilizado o comando "</w:t>
+      </w:r>
+      <w:proofErr w:type="spellStart"/>
+      <w:r>
+        <w:t>git</w:t>
+      </w:r>
+      <w:proofErr w:type="spellEnd"/>
+      <w:r>
+        <w:t xml:space="preserve"> status" para verificar as modificações efetuadas.</w:t>
+      </w:r>
+    </w:p>
+    <w:p>
+      <w:r>
+        <w:t xml:space="preserve">De seguida, as alterações foram adicionadas à </w:t>
+      </w:r>
+      <w:proofErr w:type="spellStart"/>
+      <w:r>
+        <w:t>staging</w:t>
+      </w:r>
+      <w:proofErr w:type="spellEnd"/>
+      <w:r>
+        <w:t xml:space="preserve"> </w:t>
+      </w:r>
+      <w:proofErr w:type="spellStart"/>
+      <w:r>
+        <w:t>area</w:t>
+      </w:r>
+      <w:proofErr w:type="spellEnd"/>
+      <w:r>
+        <w:t xml:space="preserve"> com o comando "</w:t>
+      </w:r>
+      <w:proofErr w:type="spellStart"/>
+      <w:r>
+        <w:t>git</w:t>
+      </w:r>
+      <w:proofErr w:type="spellEnd"/>
+      <w:r>
+        <w:t xml:space="preserve"> </w:t>
+      </w:r>
+      <w:proofErr w:type="spellStart"/>
+      <w:proofErr w:type="gramStart"/>
+      <w:r>
+        <w:t>add</w:t>
+      </w:r>
+      <w:proofErr w:type="spellEnd"/>
+      <w:r>
+        <w:t xml:space="preserve"> .</w:t>
+      </w:r>
+      <w:proofErr w:type="gramEnd"/>
+      <w:r>
+        <w:t xml:space="preserve">", sendo posteriormente registadas através de um novo </w:t>
+      </w:r>
+      <w:proofErr w:type="spellStart"/>
+      <w:r>
+        <w:t>commit</w:t>
+      </w:r>
+      <w:proofErr w:type="spellEnd"/>
+      <w:r>
+        <w:t xml:space="preserve"> com o comando "</w:t>
+      </w:r>
+      <w:proofErr w:type="spellStart"/>
+      <w:r>
+        <w:t>git</w:t>
+      </w:r>
+      <w:proofErr w:type="spellEnd"/>
+      <w:r>
+        <w:t xml:space="preserve"> </w:t>
+      </w:r>
+      <w:proofErr w:type="spellStart"/>
+      <w:r>
+        <w:t>commit</w:t>
+      </w:r>
+      <w:proofErr w:type="spellEnd"/>
+      <w:r>
+        <w:t>".</w:t>
+      </w:r>
+    </w:p>
+    <w:p>
+      <w:r>
+        <w:t xml:space="preserve">Este processo demonstra a atualização do projeto e o registo das alterações no histórico do repositório </w:t>
+      </w:r>
+      <w:proofErr w:type="spellStart"/>
+      <w:r>
+        <w:t>Git</w:t>
+      </w:r>
+      <w:proofErr w:type="spellEnd"/>
+      <w:r>
+        <w:t>.</w:t>
+      </w:r>
+    </w:p>
+    <w:p>
+      <w:r>
+        <w:rPr>
+          <w:noProof/>
+        </w:rPr>
+        <w:drawing>
+          <wp:inline distT="0" distB="0" distL="0" distR="0" wp14:anchorId="7F34A0DF" wp14:editId="520F627C">
+            <wp:extent cx="5731510" cy="1581785"/>
+            <wp:effectExtent l="0" t="0" r="2540" b="0"/>
+            <wp:docPr id="1186953988" name="Imagem 3"/>
+            <wp:cNvGraphicFramePr>
+              <a:graphicFrameLocks xmlns:a="http://schemas.openxmlformats.org/drawingml/2006/main" noChangeAspect="1"/>
+            </wp:cNvGraphicFramePr>
+            <a:graphic xmlns:a="http://schemas.openxmlformats.org/drawingml/2006/main">
+              <a:graphicData uri="http://schemas.openxmlformats.org/drawingml/2006/picture">
+                <pic:pic xmlns:pic="http://schemas.openxmlformats.org/drawingml/2006/picture">
+                  <pic:nvPicPr>
+                    <pic:cNvPr id="0" name="Picture 3"/>
+                    <pic:cNvPicPr>
+                      <a:picLocks noChangeAspect="1" noChangeArrowheads="1"/>
+                    </pic:cNvPicPr>
+                  </pic:nvPicPr>
+                  <pic:blipFill>
+                    <a:blip r:embed="rId11">
+                      <a:extLst>
+                        <a:ext uri="{28A0092B-C50C-407E-A947-70E740481C1C}">
+                          <a14:useLocalDpi xmlns:a14="http://schemas.microsoft.com/office/drawing/2010/main" val="0"/>
+                        </a:ext>
+                      </a:extLst>
+                    </a:blip>
+                    <a:srcRect/>
+                    <a:stretch>
+                      <a:fillRect/>
+                    </a:stretch>
+                  </pic:blipFill>
+                  <pic:spPr bwMode="auto">
+                    <a:xfrm>
+                      <a:off x="0" y="0"/>
+                      <a:ext cx="5731510" cy="1581785"/>
+                    </a:xfrm>
+                    <a:prstGeom prst="rect">
+                      <a:avLst/>
+                    </a:prstGeom>
+                    <a:noFill/>
+                    <a:ln>
+                      <a:noFill/>
+                    </a:ln>
+                  </pic:spPr>
+                </pic:pic>
+              </a:graphicData>
+            </a:graphic>
+          </wp:inline>
+        </w:drawing>
+      </w:r>
+    </w:p>
+    <w:p/>
+    <w:p/>
+    <w:p/>
+    <w:p>
+      <w:r>
+        <w:lastRenderedPageBreak/>
+        <w:t>Foi novamente utilizado o comando "</w:t>
+      </w:r>
+      <w:proofErr w:type="spellStart"/>
+      <w:r>
+        <w:t>git</w:t>
+      </w:r>
+      <w:proofErr w:type="spellEnd"/>
+      <w:r>
+        <w:t xml:space="preserve"> log --</w:t>
+      </w:r>
+      <w:proofErr w:type="spellStart"/>
+      <w:r>
+        <w:t>oneline</w:t>
+      </w:r>
+      <w:proofErr w:type="spellEnd"/>
+      <w:r>
+        <w:t xml:space="preserve">" para verificar o histórico de </w:t>
+      </w:r>
+      <w:proofErr w:type="spellStart"/>
+      <w:r>
+        <w:t>commits</w:t>
+      </w:r>
+      <w:proofErr w:type="spellEnd"/>
+      <w:r>
+        <w:t xml:space="preserve"> após a realização de alterações.</w:t>
+      </w:r>
+    </w:p>
+    <w:p>
+      <w:r>
+        <w:t xml:space="preserve">Foi possível observar a existência de dois </w:t>
+      </w:r>
+      <w:proofErr w:type="spellStart"/>
+      <w:r>
+        <w:t>commits</w:t>
+      </w:r>
+      <w:proofErr w:type="spellEnd"/>
+      <w:r>
+        <w:t>, demonstrando a evolução do projeto e o registo incremental das modificações efetuadas.</w:t>
+      </w:r>
+    </w:p>
+    <w:p/>
+    <w:p>
+      <w:r>
+        <w:drawing>
+          <wp:inline distT="0" distB="0" distL="0" distR="0" wp14:anchorId="2B35AFD7" wp14:editId="26D8DF22">
+            <wp:extent cx="5731510" cy="608330"/>
+            <wp:effectExtent l="0" t="0" r="2540" b="1270"/>
+            <wp:docPr id="1202079896" name="Imagem 1"/>
+            <wp:cNvGraphicFramePr>
+              <a:graphicFrameLocks xmlns:a="http://schemas.openxmlformats.org/drawingml/2006/main" noChangeAspect="1"/>
+            </wp:cNvGraphicFramePr>
+            <a:graphic xmlns:a="http://schemas.openxmlformats.org/drawingml/2006/main">
+              <a:graphicData uri="http://schemas.openxmlformats.org/drawingml/2006/picture">
+                <pic:pic xmlns:pic="http://schemas.openxmlformats.org/drawingml/2006/picture">
+                  <pic:nvPicPr>
+                    <pic:cNvPr id="1202079896" name=""/>
+                    <pic:cNvPicPr/>
+                  </pic:nvPicPr>
+                  <pic:blipFill>
+                    <a:blip r:embed="rId12"/>
+                    <a:stretch>
+                      <a:fillRect/>
+                    </a:stretch>
+                  </pic:blipFill>
+                  <pic:spPr>
+                    <a:xfrm>
+                      <a:off x="0" y="0"/>
+                      <a:ext cx="5731510" cy="608330"/>
+                    </a:xfrm>
+                    <a:prstGeom prst="rect">
+                      <a:avLst/>
+                    </a:prstGeom>
+                  </pic:spPr>
+                </pic:pic>
+              </a:graphicData>
+            </a:graphic>
+          </wp:inline>
+        </w:drawing>
+      </w:r>
+    </w:p>
+    <w:p/>
+    <w:p>
+      <w:r>
+        <w:t xml:space="preserve">Foi </w:t>
+      </w:r>
+      <w:proofErr w:type="gramStart"/>
+      <w:r>
+        <w:t>criada uma nova</w:t>
+      </w:r>
+      <w:proofErr w:type="gramEnd"/>
+      <w:r>
+        <w:t xml:space="preserve"> </w:t>
+      </w:r>
+      <w:proofErr w:type="spellStart"/>
+      <w:r>
+        <w:t>branch</w:t>
+      </w:r>
+      <w:proofErr w:type="spellEnd"/>
+      <w:r>
+        <w:t xml:space="preserve"> com o objetivo de desenvolver alterações de forma isolada.</w:t>
+      </w:r>
+    </w:p>
+    <w:p/>
+    <w:p>
+      <w:r>
+        <w:t>De seguida, foi utilizado o comando "</w:t>
+      </w:r>
+      <w:proofErr w:type="spellStart"/>
+      <w:r>
+        <w:t>git</w:t>
+      </w:r>
+      <w:proofErr w:type="spellEnd"/>
+      <w:r>
+        <w:t xml:space="preserve"> checkout" para mudar para a nova </w:t>
+      </w:r>
+      <w:proofErr w:type="spellStart"/>
+      <w:r>
+        <w:t>branch</w:t>
+      </w:r>
+      <w:proofErr w:type="spellEnd"/>
+      <w:r>
+        <w:t xml:space="preserve">, permitindo trabalhar de forma independente sem afetar a </w:t>
+      </w:r>
+      <w:proofErr w:type="spellStart"/>
+      <w:r>
+        <w:t>branch</w:t>
+      </w:r>
+      <w:proofErr w:type="spellEnd"/>
+      <w:r>
+        <w:t xml:space="preserve"> principal.</w:t>
+      </w:r>
+    </w:p>
+    <w:p>
+      <w:r>
+        <w:drawing>
+          <wp:inline distT="0" distB="0" distL="0" distR="0" wp14:anchorId="52A86254" wp14:editId="6E48301F">
+            <wp:extent cx="5731510" cy="847725"/>
+            <wp:effectExtent l="0" t="0" r="2540" b="9525"/>
+            <wp:docPr id="734992089" name="Imagem 1"/>
+            <wp:cNvGraphicFramePr>
+              <a:graphicFrameLocks xmlns:a="http://schemas.openxmlformats.org/drawingml/2006/main" noChangeAspect="1"/>
+            </wp:cNvGraphicFramePr>
+            <a:graphic xmlns:a="http://schemas.openxmlformats.org/drawingml/2006/main">
+              <a:graphicData uri="http://schemas.openxmlformats.org/drawingml/2006/picture">
+                <pic:pic xmlns:pic="http://schemas.openxmlformats.org/drawingml/2006/picture">
+                  <pic:nvPicPr>
+                    <pic:cNvPr id="734992089" name=""/>
+                    <pic:cNvPicPr/>
+                  </pic:nvPicPr>
+                  <pic:blipFill>
+                    <a:blip r:embed="rId13"/>
+                    <a:stretch>
+                      <a:fillRect/>
+                    </a:stretch>
+                  </pic:blipFill>
+                  <pic:spPr>
+                    <a:xfrm>
+                      <a:off x="0" y="0"/>
+                      <a:ext cx="5731510" cy="847725"/>
+                    </a:xfrm>
+                    <a:prstGeom prst="rect">
+                      <a:avLst/>
+                    </a:prstGeom>
+                  </pic:spPr>
+                </pic:pic>
+              </a:graphicData>
+            </a:graphic>
+          </wp:inline>
+        </w:drawing>
+      </w:r>
+    </w:p>
+    <w:p>
+      <w:r>
+        <w:drawing>
+          <wp:inline distT="0" distB="0" distL="0" distR="0" wp14:anchorId="6A465A31" wp14:editId="198FBC27">
+            <wp:extent cx="5731510" cy="744220"/>
+            <wp:effectExtent l="0" t="0" r="2540" b="0"/>
+            <wp:docPr id="1278242973" name="Imagem 1"/>
+            <wp:cNvGraphicFramePr>
+              <a:graphicFrameLocks xmlns:a="http://schemas.openxmlformats.org/drawingml/2006/main" noChangeAspect="1"/>
+            </wp:cNvGraphicFramePr>
+            <a:graphic xmlns:a="http://schemas.openxmlformats.org/drawingml/2006/main">
+              <a:graphicData uri="http://schemas.openxmlformats.org/drawingml/2006/picture">
+                <pic:pic xmlns:pic="http://schemas.openxmlformats.org/drawingml/2006/picture">
+                  <pic:nvPicPr>
+                    <pic:cNvPr id="1278242973" name=""/>
+                    <pic:cNvPicPr/>
+                  </pic:nvPicPr>
+                  <pic:blipFill>
+                    <a:blip r:embed="rId14"/>
+                    <a:stretch>
+                      <a:fillRect/>
+                    </a:stretch>
+                  </pic:blipFill>
+                  <pic:spPr>
+                    <a:xfrm>
+                      <a:off x="0" y="0"/>
+                      <a:ext cx="5731510" cy="744220"/>
+                    </a:xfrm>
+                    <a:prstGeom prst="rect">
+                      <a:avLst/>
+                    </a:prstGeom>
+                  </pic:spPr>
+                </pic:pic>
+              </a:graphicData>
+            </a:graphic>
+          </wp:inline>
+        </w:drawing>
+      </w:r>
+    </w:p>
     <w:p/>
     <w:p/>
     <w:sectPr>

</xml_diff>